<commit_message>
Add BA preprocessing and PCA labs
This commit adds a Week 7 data-preprocessing exercise that imputes missing values and normalizes feature data, plus a Week 8 dimensionality reduction analysis comparing PCA, Kernel PCA, and SVD on customer data. It also includes the generated CSV and plot artifacts and updates the Week 5 DevOps exercise documents.
</commit_message>
<xml_diff>
--- a/Sem-7 Labs/DevOps/Lab/Week5/Exercise - 5.docx
+++ b/Sem-7 Labs/DevOps/Lab/Week5/Exercise - 5.docx
@@ -12,6 +12,9 @@
       <w:r>
         <w:t xml:space="preserve"> </w:t>
       </w:r>
+      <w:r>
+        <w:t xml:space="preserve">                                                                                                                     Roll No: 2023103034</w:t>
+      </w:r>
     </w:p>
     <w:p>
       <w:r>
@@ -28,6 +31,17 @@
       </w:r>
       <w:r>
         <w:t xml:space="preserve"> </w:t>
+      </w:r>
+      <w:r>
+        <w:t xml:space="preserve">                                                                                       </w:t>
+      </w:r>
+      <w:proofErr w:type="gramStart"/>
+      <w:r>
+        <w:t>Name :</w:t>
+      </w:r>
+      <w:proofErr w:type="gramEnd"/>
+      <w:r>
+        <w:t xml:space="preserve"> Aravindhan Karthik Sathya</w:t>
       </w:r>
     </w:p>
     <w:p>
@@ -92,42 +106,21 @@
           <w:sz w:val="28"/>
           <w:szCs w:val="28"/>
         </w:rPr>
-        <w:t xml:space="preserve">To develop a Java Maven project that reads an </w:t>
+        <w:t xml:space="preserve">To develop a Java Maven project that reads an mp3 audio file and extracts the </w:t>
       </w:r>
       <w:r>
         <w:rPr>
           <w:sz w:val="28"/>
           <w:szCs w:val="28"/>
         </w:rPr>
-        <w:t>mp3</w:t>
+        <w:t>artist’s</w:t>
       </w:r>
       <w:r>
         <w:rPr>
           <w:sz w:val="28"/>
           <w:szCs w:val="28"/>
         </w:rPr>
-        <w:t xml:space="preserve"> audio file and extracts the </w:t>
-      </w:r>
-      <w:r>
-        <w:rPr>
-          <w:sz w:val="28"/>
-          <w:szCs w:val="28"/>
-        </w:rPr>
-        <w:t>artist’s</w:t>
-      </w:r>
-      <w:r>
-        <w:rPr>
-          <w:sz w:val="28"/>
-          <w:szCs w:val="28"/>
-        </w:rPr>
-        <w:t xml:space="preserve"> name</w:t>
-      </w:r>
-      <w:r>
-        <w:rPr>
-          <w:sz w:val="28"/>
-          <w:szCs w:val="28"/>
-        </w:rPr>
-        <w:t xml:space="preserve"> from the metadata of the mp3 file</w:t>
+        <w:t xml:space="preserve"> name from the metadata of the mp3 file</w:t>
       </w:r>
     </w:p>
     <w:p>
@@ -154,6 +147,9 @@
         <w:keepNext/>
       </w:pPr>
       <w:r>
+        <w:rPr>
+          <w:noProof/>
+        </w:rPr>
         <w:drawing>
           <wp:inline distT="0" distB="0" distL="0" distR="0" wp14:anchorId="72984BF1" wp14:editId="5E4913A8">
             <wp:extent cx="5731510" cy="1701800"/>
@@ -219,6 +215,9 @@
         <w:keepNext/>
       </w:pPr>
       <w:r>
+        <w:rPr>
+          <w:noProof/>
+        </w:rPr>
         <w:drawing>
           <wp:inline distT="0" distB="0" distL="0" distR="0" wp14:anchorId="1B287181" wp14:editId="2696A4C8">
             <wp:extent cx="5731510" cy="1771650"/>
@@ -287,6 +286,7 @@
         <w:rPr>
           <w:b/>
           <w:bCs/>
+          <w:noProof/>
           <w:sz w:val="32"/>
           <w:szCs w:val="32"/>
         </w:rPr>
@@ -383,6 +383,7 @@
         <w:rPr>
           <w:b/>
           <w:bCs/>
+          <w:noProof/>
           <w:sz w:val="32"/>
           <w:szCs w:val="32"/>
         </w:rPr>
@@ -1043,6 +1044,7 @@
   <w:style w:type="character" w:default="1" w:styleId="DefaultParagraphFont">
     <w:name w:val="Default Paragraph Font"/>
     <w:uiPriority w:val="1"/>
+    <w:semiHidden/>
     <w:unhideWhenUsed/>
   </w:style>
   <w:style w:type="table" w:default="1" w:styleId="TableNormal">

</xml_diff>